<commit_message>
Document setting up a Google TV box as a wall display
Adds a Screen Fleet subsection to the SOP: sideloading Fully Kiosk
Browser on a Google TV / Android TV box (onn and similar), launch on
boot, keep-screen-on, auto-reload, the energy-saver setting that would
otherwise blank the display, and powering the box from the wall so it
boots straight back onto the board after a power cycle. PDF and Word
regenerated to match.

Co-Authored-By: Claude Fable 5 <noreply@anthropic.com>
Claude-Session: https://claude.ai/code/session_01CWDgqPeGvRMTzjdKentnvt
</commit_message>
<xml_diff>
--- a/docs/Worker-Dashboard-SOP.docx
+++ b/docs/Worker-Dashboard-SOP.docx
@@ -5819,6 +5819,385 @@
     </w:p>
     <w:p>
       <w:pPr>
+        <w:pStyle w:val="Heading2"/>
+        <w:spacing w:after="120" w:before="260"/>
+      </w:pPr>
+      <w:r>
+        <w:rPr>
+          <w:b/>
+          <w:bCs/>
+          <w:color w:val="1F2328"/>
+          <w:sz w:val="24"/>
+          <w:szCs w:val="24"/>
+        </w:rPr>
+        <w:t xml:space="preserve">Setting up a Google TV / Android TV box (e.g. onn)</w:t>
+      </w:r>
+    </w:p>
+    <w:p>
+      <w:pPr>
+        <w:spacing w:after="140" w:line="288"/>
+      </w:pPr>
+      <w:r>
+        <w:t xml:space="preserve">A cheap streaming box (onn, Chromecast with Google TV, any Android TV stick) makes a fine wall display, but Google TV ships without a browser and has no built-in "open a web page at boot". </w:t>
+      </w:r>
+      <w:r>
+        <w:rPr>
+          <w:b/>
+          <w:bCs/>
+        </w:rPr>
+        <w:t xml:space="preserve">Fully Kiosk Browser</w:t>
+      </w:r>
+      <w:r>
+        <w:t xml:space="preserve"> fills both gaps: it launches itself when the box powers on, loads the screen URL full-screen, keeps the display awake, and reloads the page if it ever dies.</w:t>
+      </w:r>
+    </w:p>
+    <w:p>
+      <w:pPr>
+        <w:spacing w:after="140" w:line="288"/>
+      </w:pPr>
+      <w:r>
+        <w:rPr>
+          <w:b/>
+          <w:bCs/>
+        </w:rPr>
+        <w:t xml:space="preserve">One-time install</w:t>
+      </w:r>
+      <w:r>
+        <w:t xml:space="preserve"> (the app is not in the TV Play Store, so it is sideloaded):</w:t>
+      </w:r>
+    </w:p>
+    <w:p>
+      <w:pPr>
+        <w:pStyle w:val="ListParagraph"/>
+        <w:numPr>
+          <w:ilvl w:val="0"/>
+          <w:numId w:val="7"/>
+        </w:numPr>
+        <w:spacing w:after="90" w:line="276"/>
+      </w:pPr>
+      <w:r>
+        <w:t xml:space="preserve">On the box, open the Play Store and install </w:t>
+      </w:r>
+      <w:r>
+        <w:rPr>
+          <w:b/>
+          <w:bCs/>
+        </w:rPr>
+        <w:t xml:space="preserve">Downloader</w:t>
+      </w:r>
+      <w:r>
+        <w:t xml:space="preserve"> (by AFTVnews).</w:t>
+      </w:r>
+    </w:p>
+    <w:p>
+      <w:pPr>
+        <w:pStyle w:val="ListParagraph"/>
+        <w:numPr>
+          <w:ilvl w:val="0"/>
+          <w:numId w:val="7"/>
+        </w:numPr>
+        <w:spacing w:after="90" w:line="276"/>
+      </w:pPr>
+      <w:r>
+        <w:rPr>
+          <w:b/>
+          <w:bCs/>
+        </w:rPr>
+        <w:t xml:space="preserve">Settings → System → About</w:t>
+      </w:r>
+      <w:r>
+        <w:t xml:space="preserve"> and click </w:t>
+      </w:r>
+      <w:r>
+        <w:rPr>
+          <w:b/>
+          <w:bCs/>
+        </w:rPr>
+        <w:t xml:space="preserve">Android TV OS build</w:t>
+      </w:r>
+      <w:r>
+        <w:t xml:space="preserve"> seven times to unlock Developer options.</w:t>
+      </w:r>
+    </w:p>
+    <w:p>
+      <w:pPr>
+        <w:pStyle w:val="ListParagraph"/>
+        <w:numPr>
+          <w:ilvl w:val="0"/>
+          <w:numId w:val="7"/>
+        </w:numPr>
+        <w:spacing w:after="90" w:line="276"/>
+      </w:pPr>
+      <w:r>
+        <w:rPr>
+          <w:b/>
+          <w:bCs/>
+        </w:rPr>
+        <w:t xml:space="preserve">Settings → Apps → Security &amp; restrictions → Unknown sources</w:t>
+      </w:r>
+      <w:r>
+        <w:t xml:space="preserve"> — allow </w:t>
+      </w:r>
+      <w:r>
+        <w:rPr>
+          <w:b/>
+          <w:bCs/>
+        </w:rPr>
+        <w:t xml:space="preserve">Downloader</w:t>
+      </w:r>
+      <w:r>
+        <w:t xml:space="preserve">.</w:t>
+      </w:r>
+    </w:p>
+    <w:p>
+      <w:pPr>
+        <w:pStyle w:val="ListParagraph"/>
+        <w:numPr>
+          <w:ilvl w:val="0"/>
+          <w:numId w:val="7"/>
+        </w:numPr>
+        <w:spacing w:after="90" w:line="276"/>
+      </w:pPr>
+      <w:r>
+        <w:t xml:space="preserve">Open Downloader, go to </w:t>
+      </w:r>
+      <w:r>
+        <w:rPr>
+          <w:rFonts w:ascii="Consolas" w:cs="Consolas" w:eastAsia="Consolas" w:hAnsi="Consolas"/>
+          <w:sz w:val="19"/>
+          <w:szCs w:val="19"/>
+          <w:shd w:fill="F1F3F5" w:val="clear"/>
+        </w:rPr>
+        <w:t xml:space="preserve">fully-kiosk.com</w:t>
+      </w:r>
+      <w:r>
+        <w:t xml:space="preserve">, download the Fully Kiosk Browser APK and install it.</w:t>
+      </w:r>
+    </w:p>
+    <w:p>
+      <w:pPr>
+        <w:spacing w:after="140" w:line="288"/>
+      </w:pPr>
+      <w:r>
+        <w:rPr>
+          <w:b/>
+          <w:bCs/>
+        </w:rPr>
+        <w:t xml:space="preserve">Configure Fully Kiosk:</w:t>
+      </w:r>
+    </w:p>
+    <w:p>
+      <w:pPr>
+        <w:pStyle w:val="ListParagraph"/>
+        <w:numPr>
+          <w:ilvl w:val="0"/>
+          <w:numId w:val="8"/>
+        </w:numPr>
+        <w:spacing w:after="90" w:line="276"/>
+      </w:pPr>
+      <w:r>
+        <w:rPr>
+          <w:b/>
+          <w:bCs/>
+        </w:rPr>
+        <w:t xml:space="preserve">Start URL</w:t>
+      </w:r>
+      <w:r>
+        <w:t xml:space="preserve"> — paste the screen's </w:t>
+      </w:r>
+      <w:r>
+        <w:rPr>
+          <w:rFonts w:ascii="Consolas" w:cs="Consolas" w:eastAsia="Consolas" w:hAnsi="Consolas"/>
+          <w:sz w:val="19"/>
+          <w:szCs w:val="19"/>
+          <w:shd w:fill="F1F3F5" w:val="clear"/>
+        </w:rPr>
+        <w:t xml:space="preserve">/screen/&lt;token&gt;</w:t>
+      </w:r>
+      <w:r>
+        <w:t xml:space="preserve"> URL from Screen Fleet (use Fully's Remote Admin or a USB keyboard to avoid typing a token with the remote).</w:t>
+      </w:r>
+    </w:p>
+    <w:p>
+      <w:pPr>
+        <w:pStyle w:val="ListParagraph"/>
+        <w:numPr>
+          <w:ilvl w:val="0"/>
+          <w:numId w:val="8"/>
+        </w:numPr>
+        <w:spacing w:after="90" w:line="276"/>
+      </w:pPr>
+      <w:r>
+        <w:rPr>
+          <w:b/>
+          <w:bCs/>
+        </w:rPr>
+        <w:t xml:space="preserve">Settings → Device Management</w:t>
+      </w:r>
+      <w:r>
+        <w:t xml:space="preserve"> — turn on </w:t>
+      </w:r>
+      <w:r>
+        <w:rPr>
+          <w:b/>
+          <w:bCs/>
+        </w:rPr>
+        <w:t xml:space="preserve">Launch on Boot</w:t>
+      </w:r>
+      <w:r>
+        <w:t xml:space="preserve"> and </w:t>
+      </w:r>
+      <w:r>
+        <w:rPr>
+          <w:b/>
+          <w:bCs/>
+        </w:rPr>
+        <w:t xml:space="preserve">Keep Screen On</w:t>
+      </w:r>
+      <w:r>
+        <w:t xml:space="preserve">.</w:t>
+      </w:r>
+    </w:p>
+    <w:p>
+      <w:pPr>
+        <w:pStyle w:val="ListParagraph"/>
+        <w:numPr>
+          <w:ilvl w:val="0"/>
+          <w:numId w:val="8"/>
+        </w:numPr>
+        <w:spacing w:after="90" w:line="276"/>
+      </w:pPr>
+      <w:r>
+        <w:rPr>
+          <w:b/>
+          <w:bCs/>
+        </w:rPr>
+        <w:t xml:space="preserve">Settings → Web Auto Reload</w:t>
+      </w:r>
+      <w:r>
+        <w:t xml:space="preserve"> — turn on reload on internet reconnect and an idle reload (e.g. every few hours), so a crashed page heals itself.</w:t>
+      </w:r>
+    </w:p>
+    <w:p>
+      <w:pPr>
+        <w:pStyle w:val="ListParagraph"/>
+        <w:numPr>
+          <w:ilvl w:val="0"/>
+          <w:numId w:val="8"/>
+        </w:numPr>
+        <w:spacing w:after="90" w:line="276"/>
+      </w:pPr>
+      <w:r>
+        <w:t xml:space="preserve">Optional: the paid Plus licence (one-time, per device) adds full kiosk lockdown so the remote can't leave the app. Not required for a wall display.</w:t>
+      </w:r>
+    </w:p>
+    <w:p>
+      <w:pPr>
+        <w:spacing w:after="140" w:line="288"/>
+      </w:pPr>
+      <w:r>
+        <w:rPr>
+          <w:b/>
+          <w:bCs/>
+        </w:rPr>
+        <w:t xml:space="preserve">Box settings so it never sleeps:</w:t>
+      </w:r>
+    </w:p>
+    <w:p>
+      <w:pPr>
+        <w:pStyle w:val="ListParagraph"/>
+        <w:numPr>
+          <w:ilvl w:val="0"/>
+          <w:numId w:val="1"/>
+        </w:numPr>
+        <w:spacing w:after="90" w:line="276"/>
+      </w:pPr>
+      <w:r>
+        <w:rPr>
+          <w:b/>
+          <w:bCs/>
+        </w:rPr>
+        <w:t xml:space="preserve">Settings → System → Energy saver → Turn off display</w:t>
+      </w:r>
+      <w:r>
+        <w:t xml:space="preserve"> → </w:t>
+      </w:r>
+      <w:r>
+        <w:rPr>
+          <w:b/>
+          <w:bCs/>
+        </w:rPr>
+        <w:t xml:space="preserve">Never</w:t>
+      </w:r>
+      <w:r>
+        <w:t xml:space="preserve"> (Google TV defaults to switching the display off after a few idle hours).</w:t>
+      </w:r>
+    </w:p>
+    <w:p>
+      <w:pPr>
+        <w:pStyle w:val="ListParagraph"/>
+        <w:numPr>
+          <w:ilvl w:val="0"/>
+          <w:numId w:val="1"/>
+        </w:numPr>
+        <w:spacing w:after="90" w:line="276"/>
+      </w:pPr>
+      <w:r>
+        <w:t xml:space="preserve">Screen saver / Ambient mode → set to never start, or leave it — Fully's Keep Screen On overrides it.</w:t>
+      </w:r>
+    </w:p>
+    <w:p>
+      <w:pPr>
+        <w:spacing w:after="140" w:line="288"/>
+      </w:pPr>
+      <w:r>
+        <w:rPr>
+          <w:b/>
+          <w:bCs/>
+        </w:rPr>
+        <w:t xml:space="preserve">Power-cycle behaviour:</w:t>
+      </w:r>
+      <w:r>
+        <w:t xml:space="preserve"> power the box from its own wall adapter, not the TV's USB port (TV USB can underpower it and adds a second failure point). When power returns after an outage the box boots on its own, Fully launches on boot, and the board is back with nobody touching a remote. Enable HDMI-CEC on the TV so it wakes and switches to the box's input. If the board was up before the network was, the NO INTERNET bar shows until the connection returns, then clears itself (§20).</w:t>
+      </w:r>
+    </w:p>
+    <w:p>
+      <w:pPr>
+        <w:spacing w:after="140" w:line="288"/>
+      </w:pPr>
+      <w:r>
+        <w:rPr>
+          <w:b/>
+          <w:bCs/>
+        </w:rPr>
+        <w:t xml:space="preserve">Verify:</w:t>
+      </w:r>
+      <w:r>
+        <w:t xml:space="preserve"> the screen shows </w:t>
+      </w:r>
+      <w:r>
+        <w:rPr>
+          <w:b/>
+          <w:bCs/>
+        </w:rPr>
+        <w:t xml:space="preserve">online now</w:t>
+      </w:r>
+      <w:r>
+        <w:t xml:space="preserve"> in Screen Fleet — send </w:t>
+      </w:r>
+      <w:r>
+        <w:rPr>
+          <w:b/>
+          <w:bCs/>
+        </w:rPr>
+        <w:t xml:space="preserve">Identify</w:t>
+      </w:r>
+      <w:r>
+        <w:t xml:space="preserve"> to flash that TV and confirm you're looking at the right one.</w:t>
+      </w:r>
+    </w:p>
+    <w:p>
+      <w:pPr>
         <w:pStyle w:val="Heading1"/>
         <w:pBdr>
           <w:bottom w:val="single" w:color="D0D7DE" w:sz="6" w:space="6"/>
@@ -7280,7 +7659,7 @@
         <w:pStyle w:val="ListParagraph"/>
         <w:numPr>
           <w:ilvl w:val="0"/>
-          <w:numId w:val="7"/>
+          <w:numId w:val="9"/>
         </w:numPr>
         <w:spacing w:after="90" w:line="276"/>
       </w:pPr>
@@ -7303,7 +7682,7 @@
         <w:pStyle w:val="ListParagraph"/>
         <w:numPr>
           <w:ilvl w:val="0"/>
-          <w:numId w:val="7"/>
+          <w:numId w:val="9"/>
         </w:numPr>
         <w:spacing w:after="90" w:line="276"/>
       </w:pPr>
@@ -7316,7 +7695,7 @@
         <w:pStyle w:val="ListParagraph"/>
         <w:numPr>
           <w:ilvl w:val="0"/>
-          <w:numId w:val="7"/>
+          <w:numId w:val="9"/>
         </w:numPr>
         <w:spacing w:after="90" w:line="276"/>
       </w:pPr>
@@ -7339,7 +7718,7 @@
         <w:pStyle w:val="ListParagraph"/>
         <w:numPr>
           <w:ilvl w:val="0"/>
-          <w:numId w:val="7"/>
+          <w:numId w:val="9"/>
         </w:numPr>
         <w:spacing w:after="90" w:line="276"/>
       </w:pPr>
@@ -8665,6 +9044,30 @@
     </w:lvl>
   </w:abstractNum>
   <w:abstractNum w:abstractNumId="7" w15:restartNumberingAfterBreak="0">
+    <w:multiLevelType w:val="hybridMultilevel"/>
+    <w:lvl w:ilvl="0" w15:tentative="1">
+      <w:start w:val="1"/>
+      <w:numFmt w:val="decimal"/>
+      <w:lvlText w:val="%1."/>
+      <w:lvlJc w:val="start"/>
+      <w:pPr>
+        <w:ind w:left="520" w:hanging="300"/>
+      </w:pPr>
+    </w:lvl>
+  </w:abstractNum>
+  <w:abstractNum w:abstractNumId="8" w15:restartNumberingAfterBreak="0">
+    <w:multiLevelType w:val="hybridMultilevel"/>
+    <w:lvl w:ilvl="0" w15:tentative="1">
+      <w:start w:val="1"/>
+      <w:numFmt w:val="decimal"/>
+      <w:lvlText w:val="%1."/>
+      <w:lvlJc w:val="start"/>
+      <w:pPr>
+        <w:ind w:left="520" w:hanging="300"/>
+      </w:pPr>
+    </w:lvl>
+  </w:abstractNum>
+  <w:abstractNum w:abstractNumId="9" w15:restartNumberingAfterBreak="0">
     <w:multiLevelType w:val="hybridMultilevel"/>
     <w:lvl w:ilvl="0" w15:tentative="1">
       <w:start w:val="1"/>
@@ -8714,6 +9117,18 @@
   </w:num>
   <w:num w:numId="7">
     <w:abstractNumId w:val="7"/>
+    <w:lvlOverride w:ilvl="0">
+      <w:startOverride w:val="1"/>
+    </w:lvlOverride>
+  </w:num>
+  <w:num w:numId="8">
+    <w:abstractNumId w:val="8"/>
+    <w:lvlOverride w:ilvl="0">
+      <w:startOverride w:val="1"/>
+    </w:lvlOverride>
+  </w:num>
+  <w:num w:numId="9">
+    <w:abstractNumId w:val="9"/>
     <w:lvlOverride w:ilvl="0">
       <w:startOverride w:val="1"/>
     </w:lvlOverride>

</xml_diff>

<commit_message>
Add a per-screen dark/light toggle to Screen Fleet
Each screen row's Send controls gain a theme button next to Refresh /
Identify / Message. Theme is a persistent Screen column rather than a
one-shot command: a wall display must come back in its chosen mode after
a reboot or power cycle, which a fire-once command can't guarantee.

The screen page applies its own theme before first paint (the root
layout themes from the viewer's cookie, which a wall display doesn't
have), and the heartbeat now carries the theme on every beat, so a Fleet
toggle reaches the live screen within one ~15s poll with no reload.
Verified end to end in a real browser: server render, live flip both
ways, and a fresh load painting dark before hydration.

PATCH /api/screens/[id] accepts theme (validated to light|dark, logged
to Activity). SOP command table updated; PDF and Word regenerated.

Co-Authored-By: Claude Fable 5 <noreply@anthropic.com>
Claude-Session: https://claude.ai/code/session_01CWDgqPeGvRMTzjdKentnvt
</commit_message>
<xml_diff>
--- a/docs/Worker-Dashboard-SOP.docx
+++ b/docs/Worker-Dashboard-SOP.docx
@@ -5760,6 +5760,73 @@
           </w:p>
         </w:tc>
       </w:tr>
+      <w:tr>
+        <w:trPr>
+          <w:tblHeader w:val="false"/>
+        </w:trPr>
+        <w:tc>
+          <w:tcPr>
+            <w:tcW w:type="dxa" w:w="1700"/>
+            <w:tcMar>
+              <w:top w:type="dxa" w:w="90"/>
+              <w:left w:type="dxa" w:w="130"/>
+              <w:bottom w:type="dxa" w:w="90"/>
+              <w:right w:type="dxa" w:w="130"/>
+            </w:tcMar>
+          </w:tcPr>
+          <w:p>
+            <w:pPr>
+              <w:spacing w:after="0" w:line="264"/>
+            </w:pPr>
+            <w:r>
+              <w:rPr>
+                <w:b/>
+                <w:bCs/>
+              </w:rPr>
+              <w:t xml:space="preserve">Dark / Light mode</w:t>
+            </w:r>
+          </w:p>
+        </w:tc>
+        <w:tc>
+          <w:tcPr>
+            <w:tcW w:type="dxa" w:w="7660"/>
+            <w:tcMar>
+              <w:top w:type="dxa" w:w="90"/>
+              <w:left w:type="dxa" w:w="130"/>
+              <w:bottom w:type="dxa" w:w="90"/>
+              <w:right w:type="dxa" w:w="130"/>
+            </w:tcMar>
+          </w:tcPr>
+          <w:p>
+            <w:pPr>
+              <w:spacing w:after="0" w:line="264"/>
+            </w:pPr>
+            <w:r>
+              <w:t xml:space="preserve">Switches that screen's theme. Unlike the three commands above this is a </w:t>
+            </w:r>
+            <w:r>
+              <w:rPr>
+                <w:b/>
+                <w:bCs/>
+              </w:rPr>
+              <w:t xml:space="preserve">setting, not a one-shot</w:t>
+            </w:r>
+            <w:r>
+              <w:t xml:space="preserve"> — it sticks through reboots and power cycles. The button shows the mode it will switch </w:t>
+            </w:r>
+            <w:r>
+              <w:rPr>
+                <w:i/>
+                <w:iCs/>
+              </w:rPr>
+              <w:t xml:space="preserve">to</w:t>
+            </w:r>
+            <w:r>
+              <w:t xml:space="preserve">.</w:t>
+            </w:r>
+          </w:p>
+        </w:tc>
+      </w:tr>
     </w:tbl>
     <w:p>
       <w:pPr>
@@ -5771,7 +5838,7 @@
         <w:spacing w:after="140" w:line="288"/>
       </w:pPr>
       <w:r>
-        <w:t xml:space="preserve">Commands are picked up on the screen's next check-in, so allow a few seconds.</w:t>
+        <w:t xml:space="preserve">Commands are picked up on the screen's next check-in, so allow a few seconds — the theme toggle lands the same way, within about 15 seconds, no reload needed.</w:t>
       </w:r>
     </w:p>
     <w:p>

</xml_diff>